<commit_message>
Można pobrać załączniki 9,1,2,2a,3,6,4,7 po ich ukończeniu
</commit_message>
<xml_diff>
--- a/Projekt/app/docs/Zal_7.docx
+++ b/Projekt/app/docs/Zal_7.docx
@@ -1,6 +1,6 @@
 
 <file path=word/document.xml><?xml version="1.0" encoding="utf-8"?>
-<w:document xmlns:wpc="http://schemas.microsoft.com/office/word/2010/wordprocessingCanvas" xmlns:cx="http://schemas.microsoft.com/office/drawing/2014/chartex" xmlns:cx1="http://schemas.microsoft.com/office/drawing/2015/9/8/chartex" xmlns:cx2="http://schemas.microsoft.com/office/drawing/2015/10/21/chartex" xmlns:cx3="http://schemas.microsoft.com/office/drawing/2016/5/9/chartex" xmlns:cx4="http://schemas.microsoft.com/office/drawing/2016/5/10/chartex" xmlns:cx5="http://schemas.microsoft.com/office/drawing/2016/5/11/chartex" xmlns:cx6="http://schemas.microsoft.com/office/drawing/2016/5/12/chartex" xmlns:cx7="http://schemas.microsoft.com/office/drawing/2016/5/13/chartex" xmlns:cx8="http://schemas.microsoft.com/office/drawing/2016/5/14/chartex" xmlns:mc="http://schemas.openxmlformats.org/markup-compatibility/2006" xmlns:aink="http://schemas.microsoft.com/office/drawing/2016/ink" xmlns:am3d="http://schemas.microsoft.com/office/drawing/2017/model3d" xmlns:o="urn:schemas-microsoft-com:office:office" xmlns:oel="http://schemas.microsoft.com/office/2019/extlst" xmlns:r="http://schemas.openxmlformats.org/officeDocument/2006/relationships" xmlns:m="http://schemas.openxmlformats.org/officeDocument/2006/math" xmlns:v="urn:schemas-microsoft-com:vml" xmlns:wp14="http://schemas.microsoft.com/office/word/2010/wordprocessingDrawing" xmlns:wp="http://schemas.openxmlformats.org/drawingml/2006/wordprocessingDrawing" xmlns:w10="urn:schemas-microsoft-com:office:word" xmlns:w="http://schemas.openxmlformats.org/wordprocessingml/2006/main" xmlns:w14="http://schemas.microsoft.com/office/word/2010/wordml" xmlns:w15="http://schemas.microsoft.com/office/word/2012/wordml" xmlns:w16cex="http://schemas.microsoft.com/office/word/2018/wordml/cex" xmlns:w16cid="http://schemas.microsoft.com/office/word/2016/wordml/cid" xmlns:w16="http://schemas.microsoft.com/office/word/2018/wordml" xmlns:w16du="http://schemas.microsoft.com/office/word/2023/wordml/word16du" xmlns:w16sdtdh="http://schemas.microsoft.com/office/word/2020/wordml/sdtdatahash" xmlns:w16se="http://schemas.microsoft.com/office/word/2015/wordml/symex" xmlns:wpg="http://schemas.microsoft.com/office/word/2010/wordprocessingGroup" xmlns:wpi="http://schemas.microsoft.com/office/word/2010/wordprocessingInk" xmlns:wne="http://schemas.microsoft.com/office/word/2006/wordml" xmlns:wps="http://schemas.microsoft.com/office/word/2010/wordprocessingShape" mc:Ignorable="w14 w15 w16se w16cid w16 w16cex w16sdtdh w16du wp14">
+<w:document xmlns:wpc="http://schemas.microsoft.com/office/word/2010/wordprocessingCanvas" xmlns:cx="http://schemas.microsoft.com/office/drawing/2014/chartex" xmlns:cx1="http://schemas.microsoft.com/office/drawing/2015/9/8/chartex" xmlns:cx2="http://schemas.microsoft.com/office/drawing/2015/10/21/chartex" xmlns:cx3="http://schemas.microsoft.com/office/drawing/2016/5/9/chartex" xmlns:cx4="http://schemas.microsoft.com/office/drawing/2016/5/10/chartex" xmlns:cx5="http://schemas.microsoft.com/office/drawing/2016/5/11/chartex" xmlns:cx6="http://schemas.microsoft.com/office/drawing/2016/5/12/chartex" xmlns:cx7="http://schemas.microsoft.com/office/drawing/2016/5/13/chartex" xmlns:cx8="http://schemas.microsoft.com/office/drawing/2016/5/14/chartex" xmlns:mc="http://schemas.openxmlformats.org/markup-compatibility/2006" xmlns:aink="http://schemas.microsoft.com/office/drawing/2016/ink" xmlns:am3d="http://schemas.microsoft.com/office/drawing/2017/model3d" xmlns:o="urn:schemas-microsoft-com:office:office" xmlns:oel="http://schemas.microsoft.com/office/2019/extlst" xmlns:r="http://schemas.openxmlformats.org/officeDocument/2006/relationships" xmlns:m="http://schemas.openxmlformats.org/officeDocument/2006/math" xmlns:v="urn:schemas-microsoft-com:vml" xmlns:wp14="http://schemas.microsoft.com/office/word/2010/wordprocessingDrawing" xmlns:wp="http://schemas.openxmlformats.org/drawingml/2006/wordprocessingDrawing" xmlns:w10="urn:schemas-microsoft-com:office:word" xmlns:w="http://schemas.openxmlformats.org/wordprocessingml/2006/main" xmlns:w14="http://schemas.microsoft.com/office/word/2010/wordml" xmlns:w15="http://schemas.microsoft.com/office/word/2012/wordml" xmlns:w16cex="http://schemas.microsoft.com/office/word/2018/wordml/cex" xmlns:w16cid="http://schemas.microsoft.com/office/word/2016/wordml/cid" xmlns:w16="http://schemas.microsoft.com/office/word/2018/wordml" xmlns:w16du="http://schemas.microsoft.com/office/word/2023/wordml/word16du" xmlns:w16sdtdh="http://schemas.microsoft.com/office/word/2020/wordml/sdtdatahash" xmlns:w16sdtfl="http://schemas.microsoft.com/office/word/2024/wordml/sdtformatlock" xmlns:w16se="http://schemas.microsoft.com/office/word/2015/wordml/symex" xmlns:wpg="http://schemas.microsoft.com/office/word/2010/wordprocessingGroup" xmlns:wpi="http://schemas.microsoft.com/office/word/2010/wordprocessingInk" xmlns:wne="http://schemas.microsoft.com/office/word/2006/wordml" xmlns:wps="http://schemas.microsoft.com/office/word/2010/wordprocessingShape" mc:Ignorable="w14 w15 w16se w16cid w16 w16cex w16sdtdh w16sdtfl w16du wp14">
   <w:body>
     <w:p>
       <w:pPr>
@@ -100,20 +100,29 @@
         <w:ind w:left="215"/>
         <w:rPr>
           <w:rFonts w:asciiTheme="majorHAnsi" w:hAnsiTheme="majorHAnsi"/>
+          <w:sz w:val="22"/>
+          <w:szCs w:val="22"/>
+        </w:rPr>
+      </w:pPr>
+      <w:r>
+        <w:rPr>
+          <w:rFonts w:asciiTheme="majorHAnsi" w:hAnsiTheme="majorHAnsi"/>
+          <w:sz w:val="22"/>
+          <w:szCs w:val="22"/>
+        </w:rPr>
+        <w:t xml:space="preserve">Student:  </w:t>
+      </w:r>
+      <w:r>
+        <w:rPr>
+          <w:rFonts w:asciiTheme="majorHAnsi" w:hAnsiTheme="majorHAnsi"/>
           <w:b/>
           <w:bCs/>
           <w:sz w:val="22"/>
           <w:szCs w:val="22"/>
         </w:rPr>
-      </w:pPr>
-      <w:r>
-        <w:rPr>
-          <w:rFonts w:asciiTheme="majorHAnsi" w:hAnsiTheme="majorHAnsi"/>
-          <w:sz w:val="22"/>
-          <w:szCs w:val="22"/>
-        </w:rPr>
-        <w:t xml:space="preserve">Student:  </w:t>
-      </w:r>
+        <w:t xml:space="preserve">{{ </w:t>
+      </w:r>
+      <w:proofErr w:type="spellStart"/>
       <w:r>
         <w:rPr>
           <w:rFonts w:asciiTheme="majorHAnsi" w:hAnsiTheme="majorHAnsi"/>
@@ -122,8 +131,9 @@
           <w:sz w:val="22"/>
           <w:szCs w:val="22"/>
         </w:rPr>
-        <w:t>…………</w:t>
-      </w:r>
+        <w:t>imie_nazwisko_studenta</w:t>
+      </w:r>
+      <w:proofErr w:type="spellEnd"/>
       <w:r>
         <w:rPr>
           <w:rFonts w:asciiTheme="majorHAnsi" w:hAnsiTheme="majorHAnsi"/>
@@ -132,7 +142,55 @@
           <w:sz w:val="22"/>
           <w:szCs w:val="22"/>
         </w:rPr>
-        <w:t>.</w:t>
+        <w:t xml:space="preserve"> }}</w:t>
+      </w:r>
+      <w:r>
+        <w:rPr>
+          <w:rFonts w:asciiTheme="majorHAnsi" w:hAnsiTheme="majorHAnsi"/>
+          <w:sz w:val="22"/>
+          <w:szCs w:val="22"/>
+        </w:rPr>
+        <w:tab/>
+      </w:r>
+      <w:r>
+        <w:rPr>
+          <w:rFonts w:asciiTheme="majorHAnsi" w:hAnsiTheme="majorHAnsi"/>
+          <w:sz w:val="22"/>
+          <w:szCs w:val="22"/>
+        </w:rPr>
+        <w:tab/>
+      </w:r>
+      <w:r>
+        <w:rPr>
+          <w:rFonts w:asciiTheme="majorHAnsi" w:hAnsiTheme="majorHAnsi"/>
+          <w:sz w:val="22"/>
+          <w:szCs w:val="22"/>
+        </w:rPr>
+        <w:tab/>
+      </w:r>
+      <w:r>
+        <w:rPr>
+          <w:rFonts w:asciiTheme="majorHAnsi" w:hAnsiTheme="majorHAnsi"/>
+          <w:sz w:val="22"/>
+          <w:szCs w:val="22"/>
+        </w:rPr>
+        <w:tab/>
+      </w:r>
+      <w:r>
+        <w:rPr>
+          <w:rFonts w:asciiTheme="majorHAnsi" w:hAnsiTheme="majorHAnsi"/>
+          <w:sz w:val="22"/>
+          <w:szCs w:val="22"/>
+        </w:rPr>
+        <w:tab/>
+      </w:r>
+      <w:r>
+        <w:rPr>
+          <w:rFonts w:asciiTheme="majorHAnsi" w:hAnsiTheme="majorHAnsi"/>
+          <w:sz w:val="22"/>
+          <w:szCs w:val="22"/>
+        </w:rPr>
+        <w:t xml:space="preserve">Nr albumu:  </w:t>
       </w:r>
       <w:r>
         <w:rPr>
@@ -142,8 +200,9 @@
           <w:sz w:val="22"/>
           <w:szCs w:val="22"/>
         </w:rPr>
-        <w:t>……………………</w:t>
-      </w:r>
+        <w:t xml:space="preserve">{{ </w:t>
+      </w:r>
+      <w:proofErr w:type="spellStart"/>
       <w:r>
         <w:rPr>
           <w:rFonts w:asciiTheme="majorHAnsi" w:hAnsiTheme="majorHAnsi"/>
@@ -152,16 +211,9 @@
           <w:sz w:val="22"/>
           <w:szCs w:val="22"/>
         </w:rPr>
-        <w:t>………………………….…………………….</w:t>
-      </w:r>
-      <w:r>
-        <w:rPr>
-          <w:rFonts w:asciiTheme="majorHAnsi" w:hAnsiTheme="majorHAnsi"/>
-          <w:sz w:val="22"/>
-          <w:szCs w:val="22"/>
-        </w:rPr>
-        <w:t xml:space="preserve"> Nr albumu:  </w:t>
-      </w:r>
+        <w:t>nr_indeksu</w:t>
+      </w:r>
+      <w:proofErr w:type="spellEnd"/>
       <w:r>
         <w:rPr>
           <w:rFonts w:asciiTheme="majorHAnsi" w:hAnsiTheme="majorHAnsi"/>
@@ -170,27 +222,7 @@
           <w:sz w:val="22"/>
           <w:szCs w:val="22"/>
         </w:rPr>
-        <w:t>……</w:t>
-      </w:r>
-      <w:r>
-        <w:rPr>
-          <w:rFonts w:asciiTheme="majorHAnsi" w:hAnsiTheme="majorHAnsi"/>
-          <w:b/>
-          <w:bCs/>
-          <w:sz w:val="22"/>
-          <w:szCs w:val="22"/>
-        </w:rPr>
-        <w:t>……….</w:t>
-      </w:r>
-      <w:r>
-        <w:rPr>
-          <w:rFonts w:asciiTheme="majorHAnsi" w:hAnsiTheme="majorHAnsi"/>
-          <w:b/>
-          <w:bCs/>
-          <w:sz w:val="22"/>
-          <w:szCs w:val="22"/>
-        </w:rPr>
-        <w:t>…….</w:t>
+        <w:t xml:space="preserve"> }}</w:t>
       </w:r>
     </w:p>
     <w:p>
@@ -228,28 +260,37 @@
         <w:ind w:left="215"/>
         <w:rPr>
           <w:rFonts w:asciiTheme="majorHAnsi" w:hAnsiTheme="majorHAnsi"/>
+          <w:sz w:val="22"/>
+          <w:szCs w:val="22"/>
+        </w:rPr>
+      </w:pPr>
+      <w:r>
+        <w:rPr>
+          <w:rFonts w:asciiTheme="majorHAnsi" w:hAnsiTheme="majorHAnsi"/>
+          <w:sz w:val="22"/>
+          <w:szCs w:val="22"/>
+        </w:rPr>
+        <w:t>Specjalność</w:t>
+      </w:r>
+      <w:r>
+        <w:rPr>
+          <w:rFonts w:asciiTheme="majorHAnsi" w:hAnsiTheme="majorHAnsi"/>
+          <w:sz w:val="22"/>
+          <w:szCs w:val="22"/>
+        </w:rPr>
+        <w:t xml:space="preserve">: </w:t>
+      </w:r>
+      <w:r>
+        <w:rPr>
+          <w:rFonts w:asciiTheme="majorHAnsi" w:hAnsiTheme="majorHAnsi"/>
           <w:b/>
           <w:bCs/>
           <w:sz w:val="22"/>
           <w:szCs w:val="22"/>
         </w:rPr>
-      </w:pPr>
-      <w:r>
-        <w:rPr>
-          <w:rFonts w:asciiTheme="majorHAnsi" w:hAnsiTheme="majorHAnsi"/>
-          <w:sz w:val="22"/>
-          <w:szCs w:val="22"/>
-        </w:rPr>
-        <w:t>Specjalność</w:t>
-      </w:r>
-      <w:r>
-        <w:rPr>
-          <w:rFonts w:asciiTheme="majorHAnsi" w:hAnsiTheme="majorHAnsi"/>
-          <w:sz w:val="22"/>
-          <w:szCs w:val="22"/>
-        </w:rPr>
-        <w:t xml:space="preserve">: </w:t>
-      </w:r>
+        <w:t xml:space="preserve">{{ </w:t>
+      </w:r>
+      <w:proofErr w:type="spellStart"/>
       <w:r>
         <w:rPr>
           <w:rFonts w:asciiTheme="majorHAnsi" w:hAnsiTheme="majorHAnsi"/>
@@ -258,8 +299,9 @@
           <w:sz w:val="22"/>
           <w:szCs w:val="22"/>
         </w:rPr>
-        <w:t>…………</w:t>
-      </w:r>
+        <w:t>specjalnosc</w:t>
+      </w:r>
+      <w:proofErr w:type="spellEnd"/>
       <w:r>
         <w:rPr>
           <w:rFonts w:asciiTheme="majorHAnsi" w:hAnsiTheme="majorHAnsi"/>
@@ -268,27 +310,7 @@
           <w:sz w:val="22"/>
           <w:szCs w:val="22"/>
         </w:rPr>
-        <w:t>.</w:t>
-      </w:r>
-      <w:r>
-        <w:rPr>
-          <w:rFonts w:asciiTheme="majorHAnsi" w:hAnsiTheme="majorHAnsi"/>
-          <w:b/>
-          <w:bCs/>
-          <w:sz w:val="22"/>
-          <w:szCs w:val="22"/>
-        </w:rPr>
-        <w:t>……………………</w:t>
-      </w:r>
-      <w:r>
-        <w:rPr>
-          <w:rFonts w:asciiTheme="majorHAnsi" w:hAnsiTheme="majorHAnsi"/>
-          <w:b/>
-          <w:bCs/>
-          <w:sz w:val="22"/>
-          <w:szCs w:val="22"/>
-        </w:rPr>
-        <w:t>…………………………………………….……………….……………………</w:t>
+        <w:t xml:space="preserve"> }}</w:t>
       </w:r>
     </w:p>
     <w:p>
@@ -389,23 +411,33 @@
           <w:sz w:val="22"/>
           <w:szCs w:val="22"/>
         </w:rPr>
-        <w:t>.:  …………</w:t>
-      </w:r>
-      <w:r>
-        <w:rPr>
-          <w:rFonts w:asciiTheme="majorHAnsi" w:hAnsiTheme="majorHAnsi"/>
-          <w:sz w:val="22"/>
-          <w:szCs w:val="22"/>
-        </w:rPr>
-        <w:t>……………………</w:t>
-      </w:r>
-      <w:r>
-        <w:rPr>
-          <w:rFonts w:asciiTheme="majorHAnsi" w:hAnsiTheme="majorHAnsi"/>
-          <w:sz w:val="22"/>
-          <w:szCs w:val="22"/>
-        </w:rPr>
-        <w:t>…</w:t>
+        <w:t xml:space="preserve">.:  </w:t>
+      </w:r>
+      <w:r>
+        <w:rPr>
+          <w:rFonts w:asciiTheme="majorHAnsi" w:hAnsiTheme="majorHAnsi"/>
+          <w:sz w:val="22"/>
+          <w:szCs w:val="22"/>
+        </w:rPr>
+        <w:t xml:space="preserve">{{ </w:t>
+      </w:r>
+      <w:proofErr w:type="spellStart"/>
+      <w:r>
+        <w:rPr>
+          <w:rFonts w:asciiTheme="majorHAnsi" w:hAnsiTheme="majorHAnsi"/>
+          <w:sz w:val="22"/>
+          <w:szCs w:val="22"/>
+        </w:rPr>
+        <w:t>rok_akademicki</w:t>
+      </w:r>
+      <w:proofErr w:type="spellEnd"/>
+      <w:r>
+        <w:rPr>
+          <w:rFonts w:asciiTheme="majorHAnsi" w:hAnsiTheme="majorHAnsi"/>
+          <w:sz w:val="22"/>
+          <w:szCs w:val="22"/>
+        </w:rPr>
+        <w:t xml:space="preserve"> }}</w:t>
       </w:r>
     </w:p>
     <w:p>
@@ -496,9 +528,8 @@
         <w:spacing w:before="240"/>
         <w:rPr>
           <w:rFonts w:asciiTheme="majorHAnsi" w:hAnsiTheme="majorHAnsi"/>
-          <w:b/>
-          <w:bCs/>
-          <w:sz w:val="20"/>
+          <w:sz w:val="22"/>
+          <w:szCs w:val="22"/>
         </w:rPr>
       </w:pPr>
       <w:r>
@@ -512,38 +543,28 @@
       <w:r>
         <w:rPr>
           <w:rFonts w:asciiTheme="majorHAnsi" w:hAnsiTheme="majorHAnsi"/>
-          <w:bCs/>
-          <w:sz w:val="22"/>
-          <w:szCs w:val="22"/>
-        </w:rPr>
-        <w:t>……………………………………………………………</w:t>
-      </w:r>
-      <w:r>
-        <w:rPr>
-          <w:rFonts w:asciiTheme="majorHAnsi" w:hAnsiTheme="majorHAnsi"/>
-          <w:bCs/>
-          <w:sz w:val="22"/>
-          <w:szCs w:val="22"/>
-        </w:rPr>
-        <w:t>……………………………</w:t>
-      </w:r>
-      <w:r>
-        <w:rPr>
-          <w:rFonts w:asciiTheme="majorHAnsi" w:hAnsiTheme="majorHAnsi"/>
-          <w:bCs/>
-          <w:sz w:val="22"/>
-          <w:szCs w:val="22"/>
-        </w:rPr>
-        <w:t>…………………………………</w:t>
-      </w:r>
-      <w:r>
-        <w:rPr>
-          <w:rFonts w:asciiTheme="majorHAnsi" w:hAnsiTheme="majorHAnsi"/>
-          <w:bCs/>
-          <w:sz w:val="22"/>
-          <w:szCs w:val="22"/>
-        </w:rPr>
-        <w:t>…..</w:t>
+          <w:sz w:val="22"/>
+          <w:szCs w:val="22"/>
+        </w:rPr>
+        <w:t xml:space="preserve">{{ </w:t>
+      </w:r>
+      <w:proofErr w:type="spellStart"/>
+      <w:r>
+        <w:rPr>
+          <w:rFonts w:asciiTheme="majorHAnsi" w:hAnsiTheme="majorHAnsi"/>
+          <w:sz w:val="22"/>
+          <w:szCs w:val="22"/>
+        </w:rPr>
+        <w:t>miejsce_praktyki</w:t>
+      </w:r>
+      <w:proofErr w:type="spellEnd"/>
+      <w:r>
+        <w:rPr>
+          <w:rFonts w:asciiTheme="majorHAnsi" w:hAnsiTheme="majorHAnsi"/>
+          <w:sz w:val="22"/>
+          <w:szCs w:val="22"/>
+        </w:rPr>
+        <w:t xml:space="preserve"> }}</w:t>
       </w:r>
     </w:p>
     <w:p>
@@ -649,6 +670,32 @@
           <w:szCs w:val="22"/>
         </w:rPr>
       </w:pPr>
+      <w:r>
+        <w:rPr>
+          <w:rFonts w:asciiTheme="majorHAnsi" w:hAnsiTheme="majorHAnsi"/>
+          <w:sz w:val="22"/>
+          <w:szCs w:val="22"/>
+        </w:rPr>
+        <w:t xml:space="preserve">{{ </w:t>
+      </w:r>
+      <w:proofErr w:type="spellStart"/>
+      <w:r>
+        <w:rPr>
+          <w:rFonts w:asciiTheme="majorHAnsi" w:hAnsiTheme="majorHAnsi"/>
+          <w:sz w:val="22"/>
+          <w:szCs w:val="22"/>
+        </w:rPr>
+        <w:t>charakterystyka_miejsca</w:t>
+      </w:r>
+      <w:proofErr w:type="spellEnd"/>
+      <w:r>
+        <w:rPr>
+          <w:rFonts w:asciiTheme="majorHAnsi" w:hAnsiTheme="majorHAnsi"/>
+          <w:sz w:val="22"/>
+          <w:szCs w:val="22"/>
+        </w:rPr>
+        <w:t xml:space="preserve"> }}</w:t>
+      </w:r>
     </w:p>
     <w:p>
       <w:pPr>
@@ -807,61 +854,25 @@
           <w:sz w:val="22"/>
           <w:szCs w:val="22"/>
         </w:rPr>
-        <w:t>/</w:t>
-      </w:r>
-      <w:r>
-        <w:rPr>
-          <w:rFonts w:ascii="Times New Roman" w:hAnsi="Times New Roman"/>
-          <w:color w:val="FF0000"/>
-          <w:sz w:val="22"/>
-          <w:szCs w:val="22"/>
-        </w:rPr>
-        <w:t>Student opisuje w sposób syntetyczny</w:t>
-      </w:r>
-      <w:r>
-        <w:rPr>
-          <w:rFonts w:ascii="Times New Roman" w:hAnsi="Times New Roman"/>
-          <w:color w:val="FF0000"/>
-          <w:sz w:val="22"/>
-          <w:szCs w:val="22"/>
-        </w:rPr>
-        <w:t>,</w:t>
-      </w:r>
-      <w:r>
-        <w:rPr>
-          <w:rFonts w:ascii="Times New Roman" w:hAnsi="Times New Roman"/>
-          <w:color w:val="FF0000"/>
-          <w:sz w:val="22"/>
-          <w:szCs w:val="22"/>
-        </w:rPr>
-        <w:t xml:space="preserve"> jakie zadania wykonywał w trakcie praktyki (</w:t>
-      </w:r>
-      <w:r>
-        <w:rPr>
-          <w:rFonts w:ascii="Times New Roman" w:hAnsi="Times New Roman"/>
-          <w:b/>
-          <w:color w:val="FF0000"/>
-          <w:sz w:val="22"/>
-          <w:szCs w:val="22"/>
-        </w:rPr>
-        <w:t>jego zdaniem</w:t>
-      </w:r>
-      <w:r>
-        <w:rPr>
-          <w:rFonts w:ascii="Times New Roman" w:hAnsi="Times New Roman"/>
-          <w:color w:val="FF0000"/>
-          <w:sz w:val="22"/>
-          <w:szCs w:val="22"/>
-        </w:rPr>
-        <w:t xml:space="preserve"> najważniejsze)</w:t>
-      </w:r>
-      <w:r>
-        <w:rPr>
-          <w:rFonts w:ascii="Times New Roman" w:hAnsi="Times New Roman"/>
-          <w:sz w:val="22"/>
-          <w:szCs w:val="22"/>
-        </w:rPr>
-        <w:t>/</w:t>
+        <w:t xml:space="preserve">{{ </w:t>
+      </w:r>
+      <w:proofErr w:type="spellStart"/>
+      <w:r>
+        <w:rPr>
+          <w:rFonts w:asciiTheme="majorHAnsi" w:hAnsiTheme="majorHAnsi"/>
+          <w:sz w:val="22"/>
+          <w:szCs w:val="22"/>
+        </w:rPr>
+        <w:t>opis_i_analiza</w:t>
+      </w:r>
+      <w:proofErr w:type="spellEnd"/>
+      <w:r>
+        <w:rPr>
+          <w:rFonts w:asciiTheme="majorHAnsi" w:hAnsiTheme="majorHAnsi"/>
+          <w:sz w:val="22"/>
+          <w:szCs w:val="22"/>
+        </w:rPr>
+        <w:t xml:space="preserve"> }}</w:t>
       </w:r>
     </w:p>
     <w:p>
@@ -1033,78 +1044,25 @@
           <w:sz w:val="22"/>
           <w:szCs w:val="22"/>
         </w:rPr>
-        <w:t>/</w:t>
-      </w:r>
-      <w:r>
-        <w:rPr>
-          <w:rFonts w:ascii="Times New Roman" w:hAnsi="Times New Roman"/>
-          <w:color w:val="FF0000"/>
-          <w:sz w:val="22"/>
-          <w:szCs w:val="22"/>
-        </w:rPr>
-        <w:t>Student opisuje</w:t>
-      </w:r>
-      <w:r>
-        <w:rPr>
-          <w:rFonts w:ascii="Times New Roman" w:hAnsi="Times New Roman"/>
-          <w:color w:val="FF0000"/>
-          <w:sz w:val="22"/>
-          <w:szCs w:val="22"/>
-        </w:rPr>
-        <w:t>,</w:t>
-      </w:r>
-      <w:r>
-        <w:rPr>
-          <w:rFonts w:ascii="Times New Roman" w:hAnsi="Times New Roman"/>
-          <w:color w:val="FF0000"/>
-          <w:sz w:val="22"/>
-          <w:szCs w:val="22"/>
-        </w:rPr>
-        <w:t xml:space="preserve"> jakie kompetencje nabył w trakcie praktyki zawodowej oraz dokonuje samooceny w zakresie osiągniętych efektów uczenia się. Cytuje </w:t>
-      </w:r>
-      <w:r>
-        <w:rPr>
-          <w:rFonts w:ascii="Times New Roman" w:hAnsi="Times New Roman"/>
-          <w:color w:val="FF0000"/>
-          <w:sz w:val="22"/>
-          <w:szCs w:val="22"/>
-        </w:rPr>
-        <w:t xml:space="preserve">po kolei </w:t>
-      </w:r>
-      <w:r>
-        <w:rPr>
-          <w:rFonts w:ascii="Times New Roman" w:hAnsi="Times New Roman"/>
-          <w:color w:val="FF0000"/>
-          <w:sz w:val="22"/>
-          <w:szCs w:val="22"/>
-        </w:rPr>
-        <w:t>zakładane efekt</w:t>
-      </w:r>
-      <w:r>
-        <w:rPr>
-          <w:rFonts w:ascii="Times New Roman" w:hAnsi="Times New Roman"/>
-          <w:color w:val="FF0000"/>
-          <w:sz w:val="22"/>
-          <w:szCs w:val="22"/>
-        </w:rPr>
-        <w:t>y uczenia się i wy</w:t>
-      </w:r>
-      <w:r>
-        <w:rPr>
-          <w:rFonts w:ascii="Times New Roman" w:hAnsi="Times New Roman"/>
-          <w:color w:val="FF0000"/>
-          <w:sz w:val="22"/>
-          <w:szCs w:val="22"/>
-        </w:rPr>
-        <w:t>kazuje wykonane prace, które prowadziły do ich osiągnięcia</w:t>
-      </w:r>
-      <w:r>
-        <w:rPr>
-          <w:rFonts w:asciiTheme="majorHAnsi" w:hAnsiTheme="majorHAnsi"/>
-          <w:sz w:val="22"/>
-          <w:szCs w:val="22"/>
-        </w:rPr>
-        <w:t>/</w:t>
+        <w:t xml:space="preserve">{{ </w:t>
+      </w:r>
+      <w:proofErr w:type="spellStart"/>
+      <w:r>
+        <w:rPr>
+          <w:rFonts w:asciiTheme="majorHAnsi" w:hAnsiTheme="majorHAnsi"/>
+          <w:sz w:val="22"/>
+          <w:szCs w:val="22"/>
+        </w:rPr>
+        <w:t>wiedza_umiejetnosci</w:t>
+      </w:r>
+      <w:proofErr w:type="spellEnd"/>
+      <w:r>
+        <w:rPr>
+          <w:rFonts w:asciiTheme="majorHAnsi" w:hAnsiTheme="majorHAnsi"/>
+          <w:sz w:val="22"/>
+          <w:szCs w:val="22"/>
+        </w:rPr>
+        <w:t xml:space="preserve"> }}</w:t>
       </w:r>
     </w:p>
     <w:p>
@@ -1119,16 +1077,6 @@
     </w:p>
     <w:p>
       <w:pPr>
-        <w:ind w:left="360"/>
-        <w:rPr>
-          <w:rFonts w:asciiTheme="majorHAnsi" w:hAnsiTheme="majorHAnsi"/>
-          <w:sz w:val="22"/>
-          <w:szCs w:val="22"/>
-        </w:rPr>
-      </w:pPr>
-    </w:p>
-    <w:p>
-      <w:pPr>
         <w:rPr>
           <w:rFonts w:asciiTheme="majorHAnsi" w:hAnsiTheme="majorHAnsi"/>
           <w:sz w:val="20"/>
@@ -1161,33 +1109,64 @@
     </w:p>
     <w:p>
       <w:pPr>
-        <w:ind w:left="5670"/>
-        <w:jc w:val="center"/>
-        <w:rPr>
-          <w:rFonts w:asciiTheme="majorHAnsi" w:hAnsiTheme="majorHAnsi"/>
-          <w:sz w:val="20"/>
-        </w:rPr>
-      </w:pPr>
-      <w:r>
-        <w:rPr>
-          <w:rFonts w:asciiTheme="majorHAnsi" w:hAnsiTheme="majorHAnsi"/>
-          <w:sz w:val="20"/>
-        </w:rPr>
-        <w:t>…………………………</w:t>
-      </w:r>
-      <w:r>
-        <w:rPr>
-          <w:rFonts w:asciiTheme="majorHAnsi" w:hAnsiTheme="majorHAnsi"/>
-          <w:sz w:val="20"/>
-        </w:rPr>
-        <w:t>…..</w:t>
-      </w:r>
-      <w:r>
-        <w:rPr>
-          <w:rFonts w:asciiTheme="majorHAnsi" w:hAnsiTheme="majorHAnsi"/>
-          <w:sz w:val="20"/>
-        </w:rPr>
-        <w:t>…………………….</w:t>
+        <w:jc w:val="right"/>
+        <w:rPr>
+          <w:rFonts w:asciiTheme="majorHAnsi" w:hAnsiTheme="majorHAnsi"/>
+          <w:sz w:val="22"/>
+          <w:szCs w:val="22"/>
+        </w:rPr>
+      </w:pPr>
+      <w:r>
+        <w:rPr>
+          <w:rFonts w:asciiTheme="majorHAnsi" w:hAnsiTheme="majorHAnsi"/>
+          <w:sz w:val="22"/>
+          <w:szCs w:val="22"/>
+        </w:rPr>
+        <w:t xml:space="preserve">                                                                                                       </w:t>
+      </w:r>
+      <w:r>
+        <w:rPr>
+          <w:rFonts w:asciiTheme="majorHAnsi" w:hAnsiTheme="majorHAnsi"/>
+          <w:sz w:val="22"/>
+          <w:szCs w:val="22"/>
+        </w:rPr>
+        <w:t xml:space="preserve">{{ </w:t>
+      </w:r>
+      <w:proofErr w:type="spellStart"/>
+      <w:r>
+        <w:rPr>
+          <w:rFonts w:asciiTheme="majorHAnsi" w:hAnsiTheme="majorHAnsi"/>
+          <w:sz w:val="22"/>
+          <w:szCs w:val="22"/>
+        </w:rPr>
+        <w:t>data_na_koniec</w:t>
+      </w:r>
+      <w:proofErr w:type="spellEnd"/>
+      <w:r>
+        <w:rPr>
+          <w:rFonts w:asciiTheme="majorHAnsi" w:hAnsiTheme="majorHAnsi"/>
+          <w:sz w:val="22"/>
+          <w:szCs w:val="22"/>
+        </w:rPr>
+        <w:t xml:space="preserve"> }}, {{ </w:t>
+      </w:r>
+      <w:proofErr w:type="spellStart"/>
+      <w:r>
+        <w:rPr>
+          <w:rFonts w:asciiTheme="majorHAnsi" w:hAnsiTheme="majorHAnsi"/>
+          <w:sz w:val="22"/>
+          <w:szCs w:val="22"/>
+        </w:rPr>
+        <w:t>imie_nazwisko_studenta</w:t>
+      </w:r>
+      <w:proofErr w:type="spellEnd"/>
+      <w:r>
+        <w:rPr>
+          <w:rFonts w:asciiTheme="majorHAnsi" w:hAnsiTheme="majorHAnsi"/>
+          <w:sz w:val="22"/>
+          <w:szCs w:val="22"/>
+        </w:rPr>
+        <w:t xml:space="preserve"> }}</w:t>
       </w:r>
     </w:p>
     <w:p>
@@ -1231,7 +1210,7 @@
 </file>
 
 <file path=word/endnotes.xml><?xml version="1.0" encoding="utf-8"?>
-<w:endnotes xmlns:wpc="http://schemas.microsoft.com/office/word/2010/wordprocessingCanvas" xmlns:cx="http://schemas.microsoft.com/office/drawing/2014/chartex" xmlns:cx1="http://schemas.microsoft.com/office/drawing/2015/9/8/chartex" xmlns:cx2="http://schemas.microsoft.com/office/drawing/2015/10/21/chartex" xmlns:cx3="http://schemas.microsoft.com/office/drawing/2016/5/9/chartex" xmlns:cx4="http://schemas.microsoft.com/office/drawing/2016/5/10/chartex" xmlns:cx5="http://schemas.microsoft.com/office/drawing/2016/5/11/chartex" xmlns:cx6="http://schemas.microsoft.com/office/drawing/2016/5/12/chartex" xmlns:cx7="http://schemas.microsoft.com/office/drawing/2016/5/13/chartex" xmlns:cx8="http://schemas.microsoft.com/office/drawing/2016/5/14/chartex" xmlns:mc="http://schemas.openxmlformats.org/markup-compatibility/2006" xmlns:aink="http://schemas.microsoft.com/office/drawing/2016/ink" xmlns:am3d="http://schemas.microsoft.com/office/drawing/2017/model3d" xmlns:o="urn:schemas-microsoft-com:office:office" xmlns:oel="http://schemas.microsoft.com/office/2019/extlst" xmlns:r="http://schemas.openxmlformats.org/officeDocument/2006/relationships" xmlns:m="http://schemas.openxmlformats.org/officeDocument/2006/math" xmlns:v="urn:schemas-microsoft-com:vml" xmlns:wp14="http://schemas.microsoft.com/office/word/2010/wordprocessingDrawing" xmlns:wp="http://schemas.openxmlformats.org/drawingml/2006/wordprocessingDrawing" xmlns:w10="urn:schemas-microsoft-com:office:word" xmlns:w="http://schemas.openxmlformats.org/wordprocessingml/2006/main" xmlns:w14="http://schemas.microsoft.com/office/word/2010/wordml" xmlns:w15="http://schemas.microsoft.com/office/word/2012/wordml" xmlns:w16cex="http://schemas.microsoft.com/office/word/2018/wordml/cex" xmlns:w16cid="http://schemas.microsoft.com/office/word/2016/wordml/cid" xmlns:w16="http://schemas.microsoft.com/office/word/2018/wordml" xmlns:w16du="http://schemas.microsoft.com/office/word/2023/wordml/word16du" xmlns:w16sdtdh="http://schemas.microsoft.com/office/word/2020/wordml/sdtdatahash" xmlns:w16se="http://schemas.microsoft.com/office/word/2015/wordml/symex" xmlns:wpg="http://schemas.microsoft.com/office/word/2010/wordprocessingGroup" xmlns:wpi="http://schemas.microsoft.com/office/word/2010/wordprocessingInk" xmlns:wne="http://schemas.microsoft.com/office/word/2006/wordml" xmlns:wps="http://schemas.microsoft.com/office/word/2010/wordprocessingShape" mc:Ignorable="w14 w15 w16se w16cid w16 w16cex w16sdtdh w16du wp14">
+<w:endnotes xmlns:wpc="http://schemas.microsoft.com/office/word/2010/wordprocessingCanvas" xmlns:cx="http://schemas.microsoft.com/office/drawing/2014/chartex" xmlns:cx1="http://schemas.microsoft.com/office/drawing/2015/9/8/chartex" xmlns:cx2="http://schemas.microsoft.com/office/drawing/2015/10/21/chartex" xmlns:cx3="http://schemas.microsoft.com/office/drawing/2016/5/9/chartex" xmlns:cx4="http://schemas.microsoft.com/office/drawing/2016/5/10/chartex" xmlns:cx5="http://schemas.microsoft.com/office/drawing/2016/5/11/chartex" xmlns:cx6="http://schemas.microsoft.com/office/drawing/2016/5/12/chartex" xmlns:cx7="http://schemas.microsoft.com/office/drawing/2016/5/13/chartex" xmlns:cx8="http://schemas.microsoft.com/office/drawing/2016/5/14/chartex" xmlns:mc="http://schemas.openxmlformats.org/markup-compatibility/2006" xmlns:aink="http://schemas.microsoft.com/office/drawing/2016/ink" xmlns:am3d="http://schemas.microsoft.com/office/drawing/2017/model3d" xmlns:o="urn:schemas-microsoft-com:office:office" xmlns:oel="http://schemas.microsoft.com/office/2019/extlst" xmlns:r="http://schemas.openxmlformats.org/officeDocument/2006/relationships" xmlns:m="http://schemas.openxmlformats.org/officeDocument/2006/math" xmlns:v="urn:schemas-microsoft-com:vml" xmlns:wp14="http://schemas.microsoft.com/office/word/2010/wordprocessingDrawing" xmlns:wp="http://schemas.openxmlformats.org/drawingml/2006/wordprocessingDrawing" xmlns:w10="urn:schemas-microsoft-com:office:word" xmlns:w="http://schemas.openxmlformats.org/wordprocessingml/2006/main" xmlns:w14="http://schemas.microsoft.com/office/word/2010/wordml" xmlns:w15="http://schemas.microsoft.com/office/word/2012/wordml" xmlns:w16cex="http://schemas.microsoft.com/office/word/2018/wordml/cex" xmlns:w16cid="http://schemas.microsoft.com/office/word/2016/wordml/cid" xmlns:w16="http://schemas.microsoft.com/office/word/2018/wordml" xmlns:w16du="http://schemas.microsoft.com/office/word/2023/wordml/word16du" xmlns:w16sdtdh="http://schemas.microsoft.com/office/word/2020/wordml/sdtdatahash" xmlns:w16sdtfl="http://schemas.microsoft.com/office/word/2024/wordml/sdtformatlock" xmlns:w16se="http://schemas.microsoft.com/office/word/2015/wordml/symex" xmlns:wpg="http://schemas.microsoft.com/office/word/2010/wordprocessingGroup" xmlns:wpi="http://schemas.microsoft.com/office/word/2010/wordprocessingInk" xmlns:wne="http://schemas.microsoft.com/office/word/2006/wordml" xmlns:wps="http://schemas.microsoft.com/office/word/2010/wordprocessingShape" mc:Ignorable="w14 w15 w16se w16cid w16 w16cex w16sdtdh w16sdtfl w16du wp14">
   <w:endnote w:type="separator" w:id="-1">
     <w:p>
       <w:r>
@@ -1250,7 +1229,7 @@
 </file>
 
 <file path=word/footer1.xml><?xml version="1.0" encoding="utf-8"?>
-<w:ftr xmlns:wpc="http://schemas.microsoft.com/office/word/2010/wordprocessingCanvas" xmlns:cx="http://schemas.microsoft.com/office/drawing/2014/chartex" xmlns:cx1="http://schemas.microsoft.com/office/drawing/2015/9/8/chartex" xmlns:cx2="http://schemas.microsoft.com/office/drawing/2015/10/21/chartex" xmlns:cx3="http://schemas.microsoft.com/office/drawing/2016/5/9/chartex" xmlns:cx4="http://schemas.microsoft.com/office/drawing/2016/5/10/chartex" xmlns:cx5="http://schemas.microsoft.com/office/drawing/2016/5/11/chartex" xmlns:cx6="http://schemas.microsoft.com/office/drawing/2016/5/12/chartex" xmlns:cx7="http://schemas.microsoft.com/office/drawing/2016/5/13/chartex" xmlns:cx8="http://schemas.microsoft.com/office/drawing/2016/5/14/chartex" xmlns:mc="http://schemas.openxmlformats.org/markup-compatibility/2006" xmlns:aink="http://schemas.microsoft.com/office/drawing/2016/ink" xmlns:am3d="http://schemas.microsoft.com/office/drawing/2017/model3d" xmlns:o="urn:schemas-microsoft-com:office:office" xmlns:oel="http://schemas.microsoft.com/office/2019/extlst" xmlns:r="http://schemas.openxmlformats.org/officeDocument/2006/relationships" xmlns:m="http://schemas.openxmlformats.org/officeDocument/2006/math" xmlns:v="urn:schemas-microsoft-com:vml" xmlns:wp14="http://schemas.microsoft.com/office/word/2010/wordprocessingDrawing" xmlns:wp="http://schemas.openxmlformats.org/drawingml/2006/wordprocessingDrawing" xmlns:w10="urn:schemas-microsoft-com:office:word" xmlns:w="http://schemas.openxmlformats.org/wordprocessingml/2006/main" xmlns:w14="http://schemas.microsoft.com/office/word/2010/wordml" xmlns:w15="http://schemas.microsoft.com/office/word/2012/wordml" xmlns:w16cex="http://schemas.microsoft.com/office/word/2018/wordml/cex" xmlns:w16cid="http://schemas.microsoft.com/office/word/2016/wordml/cid" xmlns:w16="http://schemas.microsoft.com/office/word/2018/wordml" xmlns:w16du="http://schemas.microsoft.com/office/word/2023/wordml/word16du" xmlns:w16sdtdh="http://schemas.microsoft.com/office/word/2020/wordml/sdtdatahash" xmlns:w16se="http://schemas.microsoft.com/office/word/2015/wordml/symex" xmlns:wpg="http://schemas.microsoft.com/office/word/2010/wordprocessingGroup" xmlns:wpi="http://schemas.microsoft.com/office/word/2010/wordprocessingInk" xmlns:wne="http://schemas.microsoft.com/office/word/2006/wordml" xmlns:wps="http://schemas.microsoft.com/office/word/2010/wordprocessingShape" mc:Ignorable="w14 w15 w16se w16cid w16 w16cex w16sdtdh w16du wp14">
+<w:ftr xmlns:wpc="http://schemas.microsoft.com/office/word/2010/wordprocessingCanvas" xmlns:cx="http://schemas.microsoft.com/office/drawing/2014/chartex" xmlns:cx1="http://schemas.microsoft.com/office/drawing/2015/9/8/chartex" xmlns:cx2="http://schemas.microsoft.com/office/drawing/2015/10/21/chartex" xmlns:cx3="http://schemas.microsoft.com/office/drawing/2016/5/9/chartex" xmlns:cx4="http://schemas.microsoft.com/office/drawing/2016/5/10/chartex" xmlns:cx5="http://schemas.microsoft.com/office/drawing/2016/5/11/chartex" xmlns:cx6="http://schemas.microsoft.com/office/drawing/2016/5/12/chartex" xmlns:cx7="http://schemas.microsoft.com/office/drawing/2016/5/13/chartex" xmlns:cx8="http://schemas.microsoft.com/office/drawing/2016/5/14/chartex" xmlns:mc="http://schemas.openxmlformats.org/markup-compatibility/2006" xmlns:aink="http://schemas.microsoft.com/office/drawing/2016/ink" xmlns:am3d="http://schemas.microsoft.com/office/drawing/2017/model3d" xmlns:o="urn:schemas-microsoft-com:office:office" xmlns:oel="http://schemas.microsoft.com/office/2019/extlst" xmlns:r="http://schemas.openxmlformats.org/officeDocument/2006/relationships" xmlns:m="http://schemas.openxmlformats.org/officeDocument/2006/math" xmlns:v="urn:schemas-microsoft-com:vml" xmlns:wp14="http://schemas.microsoft.com/office/word/2010/wordprocessingDrawing" xmlns:wp="http://schemas.openxmlformats.org/drawingml/2006/wordprocessingDrawing" xmlns:w10="urn:schemas-microsoft-com:office:word" xmlns:w="http://schemas.openxmlformats.org/wordprocessingml/2006/main" xmlns:w14="http://schemas.microsoft.com/office/word/2010/wordml" xmlns:w15="http://schemas.microsoft.com/office/word/2012/wordml" xmlns:w16cex="http://schemas.microsoft.com/office/word/2018/wordml/cex" xmlns:w16cid="http://schemas.microsoft.com/office/word/2016/wordml/cid" xmlns:w16="http://schemas.microsoft.com/office/word/2018/wordml" xmlns:w16du="http://schemas.microsoft.com/office/word/2023/wordml/word16du" xmlns:w16sdtdh="http://schemas.microsoft.com/office/word/2020/wordml/sdtdatahash" xmlns:w16sdtfl="http://schemas.microsoft.com/office/word/2024/wordml/sdtformatlock" xmlns:w16se="http://schemas.microsoft.com/office/word/2015/wordml/symex" xmlns:wpg="http://schemas.microsoft.com/office/word/2010/wordprocessingGroup" xmlns:wpi="http://schemas.microsoft.com/office/word/2010/wordprocessingInk" xmlns:wne="http://schemas.microsoft.com/office/word/2006/wordml" xmlns:wps="http://schemas.microsoft.com/office/word/2010/wordprocessingShape" mc:Ignorable="w14 w15 w16se w16cid w16 w16cex w16sdtdh w16sdtfl w16du wp14">
   <w:sdt>
     <w:sdtPr>
       <w:id w:val="98381352"/>
@@ -1259,7 +1238,6 @@
         <w:docPartUnique/>
       </w:docPartObj>
     </w:sdtPr>
-    <w:sdtEndPr/>
     <w:sdtContent>
       <w:p>
         <w:pPr>
@@ -1364,7 +1342,7 @@
 </file>
 
 <file path=word/footnotes.xml><?xml version="1.0" encoding="utf-8"?>
-<w:footnotes xmlns:wpc="http://schemas.microsoft.com/office/word/2010/wordprocessingCanvas" xmlns:cx="http://schemas.microsoft.com/office/drawing/2014/chartex" xmlns:cx1="http://schemas.microsoft.com/office/drawing/2015/9/8/chartex" xmlns:cx2="http://schemas.microsoft.com/office/drawing/2015/10/21/chartex" xmlns:cx3="http://schemas.microsoft.com/office/drawing/2016/5/9/chartex" xmlns:cx4="http://schemas.microsoft.com/office/drawing/2016/5/10/chartex" xmlns:cx5="http://schemas.microsoft.com/office/drawing/2016/5/11/chartex" xmlns:cx6="http://schemas.microsoft.com/office/drawing/2016/5/12/chartex" xmlns:cx7="http://schemas.microsoft.com/office/drawing/2016/5/13/chartex" xmlns:cx8="http://schemas.microsoft.com/office/drawing/2016/5/14/chartex" xmlns:mc="http://schemas.openxmlformats.org/markup-compatibility/2006" xmlns:aink="http://schemas.microsoft.com/office/drawing/2016/ink" xmlns:am3d="http://schemas.microsoft.com/office/drawing/2017/model3d" xmlns:o="urn:schemas-microsoft-com:office:office" xmlns:oel="http://schemas.microsoft.com/office/2019/extlst" xmlns:r="http://schemas.openxmlformats.org/officeDocument/2006/relationships" xmlns:m="http://schemas.openxmlformats.org/officeDocument/2006/math" xmlns:v="urn:schemas-microsoft-com:vml" xmlns:wp14="http://schemas.microsoft.com/office/word/2010/wordprocessingDrawing" xmlns:wp="http://schemas.openxmlformats.org/drawingml/2006/wordprocessingDrawing" xmlns:w10="urn:schemas-microsoft-com:office:word" xmlns:w="http://schemas.openxmlformats.org/wordprocessingml/2006/main" xmlns:w14="http://schemas.microsoft.com/office/word/2010/wordml" xmlns:w15="http://schemas.microsoft.com/office/word/2012/wordml" xmlns:w16cex="http://schemas.microsoft.com/office/word/2018/wordml/cex" xmlns:w16cid="http://schemas.microsoft.com/office/word/2016/wordml/cid" xmlns:w16="http://schemas.microsoft.com/office/word/2018/wordml" xmlns:w16du="http://schemas.microsoft.com/office/word/2023/wordml/word16du" xmlns:w16sdtdh="http://schemas.microsoft.com/office/word/2020/wordml/sdtdatahash" xmlns:w16se="http://schemas.microsoft.com/office/word/2015/wordml/symex" xmlns:wpg="http://schemas.microsoft.com/office/word/2010/wordprocessingGroup" xmlns:wpi="http://schemas.microsoft.com/office/word/2010/wordprocessingInk" xmlns:wne="http://schemas.microsoft.com/office/word/2006/wordml" xmlns:wps="http://schemas.microsoft.com/office/word/2010/wordprocessingShape" mc:Ignorable="w14 w15 w16se w16cid w16 w16cex w16sdtdh w16du wp14">
+<w:footnotes xmlns:wpc="http://schemas.microsoft.com/office/word/2010/wordprocessingCanvas" xmlns:cx="http://schemas.microsoft.com/office/drawing/2014/chartex" xmlns:cx1="http://schemas.microsoft.com/office/drawing/2015/9/8/chartex" xmlns:cx2="http://schemas.microsoft.com/office/drawing/2015/10/21/chartex" xmlns:cx3="http://schemas.microsoft.com/office/drawing/2016/5/9/chartex" xmlns:cx4="http://schemas.microsoft.com/office/drawing/2016/5/10/chartex" xmlns:cx5="http://schemas.microsoft.com/office/drawing/2016/5/11/chartex" xmlns:cx6="http://schemas.microsoft.com/office/drawing/2016/5/12/chartex" xmlns:cx7="http://schemas.microsoft.com/office/drawing/2016/5/13/chartex" xmlns:cx8="http://schemas.microsoft.com/office/drawing/2016/5/14/chartex" xmlns:mc="http://schemas.openxmlformats.org/markup-compatibility/2006" xmlns:aink="http://schemas.microsoft.com/office/drawing/2016/ink" xmlns:am3d="http://schemas.microsoft.com/office/drawing/2017/model3d" xmlns:o="urn:schemas-microsoft-com:office:office" xmlns:oel="http://schemas.microsoft.com/office/2019/extlst" xmlns:r="http://schemas.openxmlformats.org/officeDocument/2006/relationships" xmlns:m="http://schemas.openxmlformats.org/officeDocument/2006/math" xmlns:v="urn:schemas-microsoft-com:vml" xmlns:wp14="http://schemas.microsoft.com/office/word/2010/wordprocessingDrawing" xmlns:wp="http://schemas.openxmlformats.org/drawingml/2006/wordprocessingDrawing" xmlns:w10="urn:schemas-microsoft-com:office:word" xmlns:w="http://schemas.openxmlformats.org/wordprocessingml/2006/main" xmlns:w14="http://schemas.microsoft.com/office/word/2010/wordml" xmlns:w15="http://schemas.microsoft.com/office/word/2012/wordml" xmlns:w16cex="http://schemas.microsoft.com/office/word/2018/wordml/cex" xmlns:w16cid="http://schemas.microsoft.com/office/word/2016/wordml/cid" xmlns:w16="http://schemas.microsoft.com/office/word/2018/wordml" xmlns:w16du="http://schemas.microsoft.com/office/word/2023/wordml/word16du" xmlns:w16sdtdh="http://schemas.microsoft.com/office/word/2020/wordml/sdtdatahash" xmlns:w16sdtfl="http://schemas.microsoft.com/office/word/2024/wordml/sdtformatlock" xmlns:w16se="http://schemas.microsoft.com/office/word/2015/wordml/symex" xmlns:wpg="http://schemas.microsoft.com/office/word/2010/wordprocessingGroup" xmlns:wpi="http://schemas.microsoft.com/office/word/2010/wordprocessingInk" xmlns:wne="http://schemas.microsoft.com/office/word/2006/wordml" xmlns:wps="http://schemas.microsoft.com/office/word/2010/wordprocessingShape" mc:Ignorable="w14 w15 w16se w16cid w16 w16cex w16sdtdh w16sdtfl w16du wp14">
   <w:footnote w:type="separator" w:id="-1">
     <w:p>
       <w:r>
@@ -1383,7 +1361,7 @@
 </file>
 
 <file path=word/header1.xml><?xml version="1.0" encoding="utf-8"?>
-<w:hdr xmlns:wpc="http://schemas.microsoft.com/office/word/2010/wordprocessingCanvas" xmlns:cx="http://schemas.microsoft.com/office/drawing/2014/chartex" xmlns:cx1="http://schemas.microsoft.com/office/drawing/2015/9/8/chartex" xmlns:cx2="http://schemas.microsoft.com/office/drawing/2015/10/21/chartex" xmlns:cx3="http://schemas.microsoft.com/office/drawing/2016/5/9/chartex" xmlns:cx4="http://schemas.microsoft.com/office/drawing/2016/5/10/chartex" xmlns:cx5="http://schemas.microsoft.com/office/drawing/2016/5/11/chartex" xmlns:cx6="http://schemas.microsoft.com/office/drawing/2016/5/12/chartex" xmlns:cx7="http://schemas.microsoft.com/office/drawing/2016/5/13/chartex" xmlns:cx8="http://schemas.microsoft.com/office/drawing/2016/5/14/chartex" xmlns:mc="http://schemas.openxmlformats.org/markup-compatibility/2006" xmlns:aink="http://schemas.microsoft.com/office/drawing/2016/ink" xmlns:am3d="http://schemas.microsoft.com/office/drawing/2017/model3d" xmlns:o="urn:schemas-microsoft-com:office:office" xmlns:oel="http://schemas.microsoft.com/office/2019/extlst" xmlns:r="http://schemas.openxmlformats.org/officeDocument/2006/relationships" xmlns:m="http://schemas.openxmlformats.org/officeDocument/2006/math" xmlns:v="urn:schemas-microsoft-com:vml" xmlns:wp14="http://schemas.microsoft.com/office/word/2010/wordprocessingDrawing" xmlns:wp="http://schemas.openxmlformats.org/drawingml/2006/wordprocessingDrawing" xmlns:w10="urn:schemas-microsoft-com:office:word" xmlns:w="http://schemas.openxmlformats.org/wordprocessingml/2006/main" xmlns:w14="http://schemas.microsoft.com/office/word/2010/wordml" xmlns:w15="http://schemas.microsoft.com/office/word/2012/wordml" xmlns:w16cex="http://schemas.microsoft.com/office/word/2018/wordml/cex" xmlns:w16cid="http://schemas.microsoft.com/office/word/2016/wordml/cid" xmlns:w16="http://schemas.microsoft.com/office/word/2018/wordml" xmlns:w16du="http://schemas.microsoft.com/office/word/2023/wordml/word16du" xmlns:w16sdtdh="http://schemas.microsoft.com/office/word/2020/wordml/sdtdatahash" xmlns:w16se="http://schemas.microsoft.com/office/word/2015/wordml/symex" xmlns:wpg="http://schemas.microsoft.com/office/word/2010/wordprocessingGroup" xmlns:wpi="http://schemas.microsoft.com/office/word/2010/wordprocessingInk" xmlns:wne="http://schemas.microsoft.com/office/word/2006/wordml" xmlns:wps="http://schemas.microsoft.com/office/word/2010/wordprocessingShape" mc:Ignorable="w14 w15 w16se w16cid w16 w16cex w16sdtdh w16du wp14">
+<w:hdr xmlns:wpc="http://schemas.microsoft.com/office/word/2010/wordprocessingCanvas" xmlns:cx="http://schemas.microsoft.com/office/drawing/2014/chartex" xmlns:cx1="http://schemas.microsoft.com/office/drawing/2015/9/8/chartex" xmlns:cx2="http://schemas.microsoft.com/office/drawing/2015/10/21/chartex" xmlns:cx3="http://schemas.microsoft.com/office/drawing/2016/5/9/chartex" xmlns:cx4="http://schemas.microsoft.com/office/drawing/2016/5/10/chartex" xmlns:cx5="http://schemas.microsoft.com/office/drawing/2016/5/11/chartex" xmlns:cx6="http://schemas.microsoft.com/office/drawing/2016/5/12/chartex" xmlns:cx7="http://schemas.microsoft.com/office/drawing/2016/5/13/chartex" xmlns:cx8="http://schemas.microsoft.com/office/drawing/2016/5/14/chartex" xmlns:mc="http://schemas.openxmlformats.org/markup-compatibility/2006" xmlns:aink="http://schemas.microsoft.com/office/drawing/2016/ink" xmlns:am3d="http://schemas.microsoft.com/office/drawing/2017/model3d" xmlns:o="urn:schemas-microsoft-com:office:office" xmlns:oel="http://schemas.microsoft.com/office/2019/extlst" xmlns:r="http://schemas.openxmlformats.org/officeDocument/2006/relationships" xmlns:m="http://schemas.openxmlformats.org/officeDocument/2006/math" xmlns:v="urn:schemas-microsoft-com:vml" xmlns:wp14="http://schemas.microsoft.com/office/word/2010/wordprocessingDrawing" xmlns:wp="http://schemas.openxmlformats.org/drawingml/2006/wordprocessingDrawing" xmlns:w10="urn:schemas-microsoft-com:office:word" xmlns:w="http://schemas.openxmlformats.org/wordprocessingml/2006/main" xmlns:w14="http://schemas.microsoft.com/office/word/2010/wordml" xmlns:w15="http://schemas.microsoft.com/office/word/2012/wordml" xmlns:w16cex="http://schemas.microsoft.com/office/word/2018/wordml/cex" xmlns:w16cid="http://schemas.microsoft.com/office/word/2016/wordml/cid" xmlns:w16="http://schemas.microsoft.com/office/word/2018/wordml" xmlns:w16du="http://schemas.microsoft.com/office/word/2023/wordml/word16du" xmlns:w16sdtdh="http://schemas.microsoft.com/office/word/2020/wordml/sdtdatahash" xmlns:w16sdtfl="http://schemas.microsoft.com/office/word/2024/wordml/sdtformatlock" xmlns:w16se="http://schemas.microsoft.com/office/word/2015/wordml/symex" xmlns:wpg="http://schemas.microsoft.com/office/word/2010/wordprocessingGroup" xmlns:wpi="http://schemas.microsoft.com/office/word/2010/wordprocessingInk" xmlns:wne="http://schemas.microsoft.com/office/word/2006/wordml" xmlns:wps="http://schemas.microsoft.com/office/word/2010/wordprocessingShape" mc:Ignorable="w14 w15 w16se w16cid w16 w16cex w16sdtdh w16sdtfl w16du wp14">
   <w:p>
     <w:pPr>
       <w:spacing w:after="120"/>
@@ -1431,7 +1409,7 @@
 </file>
 
 <file path=word/numbering.xml><?xml version="1.0" encoding="utf-8"?>
-<w:numbering xmlns:wpc="http://schemas.microsoft.com/office/word/2010/wordprocessingCanvas" xmlns:cx="http://schemas.microsoft.com/office/drawing/2014/chartex" xmlns:cx1="http://schemas.microsoft.com/office/drawing/2015/9/8/chartex" xmlns:cx2="http://schemas.microsoft.com/office/drawing/2015/10/21/chartex" xmlns:cx3="http://schemas.microsoft.com/office/drawing/2016/5/9/chartex" xmlns:cx4="http://schemas.microsoft.com/office/drawing/2016/5/10/chartex" xmlns:cx5="http://schemas.microsoft.com/office/drawing/2016/5/11/chartex" xmlns:cx6="http://schemas.microsoft.com/office/drawing/2016/5/12/chartex" xmlns:cx7="http://schemas.microsoft.com/office/drawing/2016/5/13/chartex" xmlns:cx8="http://schemas.microsoft.com/office/drawing/2016/5/14/chartex" xmlns:mc="http://schemas.openxmlformats.org/markup-compatibility/2006" xmlns:aink="http://schemas.microsoft.com/office/drawing/2016/ink" xmlns:am3d="http://schemas.microsoft.com/office/drawing/2017/model3d" xmlns:o="urn:schemas-microsoft-com:office:office" xmlns:oel="http://schemas.microsoft.com/office/2019/extlst" xmlns:r="http://schemas.openxmlformats.org/officeDocument/2006/relationships" xmlns:m="http://schemas.openxmlformats.org/officeDocument/2006/math" xmlns:v="urn:schemas-microsoft-com:vml" xmlns:wp14="http://schemas.microsoft.com/office/word/2010/wordprocessingDrawing" xmlns:wp="http://schemas.openxmlformats.org/drawingml/2006/wordprocessingDrawing" xmlns:w10="urn:schemas-microsoft-com:office:word" xmlns:w="http://schemas.openxmlformats.org/wordprocessingml/2006/main" xmlns:w14="http://schemas.microsoft.com/office/word/2010/wordml" xmlns:w15="http://schemas.microsoft.com/office/word/2012/wordml" xmlns:w16cex="http://schemas.microsoft.com/office/word/2018/wordml/cex" xmlns:w16cid="http://schemas.microsoft.com/office/word/2016/wordml/cid" xmlns:w16="http://schemas.microsoft.com/office/word/2018/wordml" xmlns:w16du="http://schemas.microsoft.com/office/word/2023/wordml/word16du" xmlns:w16sdtdh="http://schemas.microsoft.com/office/word/2020/wordml/sdtdatahash" xmlns:w16se="http://schemas.microsoft.com/office/word/2015/wordml/symex" xmlns:wpg="http://schemas.microsoft.com/office/word/2010/wordprocessingGroup" xmlns:wpi="http://schemas.microsoft.com/office/word/2010/wordprocessingInk" xmlns:wne="http://schemas.microsoft.com/office/word/2006/wordml" xmlns:wps="http://schemas.microsoft.com/office/word/2010/wordprocessingShape" mc:Ignorable="w14 w15 w16se w16cid w16 w16cex w16sdtdh w16du wp14">
+<w:numbering xmlns:wpc="http://schemas.microsoft.com/office/word/2010/wordprocessingCanvas" xmlns:cx="http://schemas.microsoft.com/office/drawing/2014/chartex" xmlns:cx1="http://schemas.microsoft.com/office/drawing/2015/9/8/chartex" xmlns:cx2="http://schemas.microsoft.com/office/drawing/2015/10/21/chartex" xmlns:cx3="http://schemas.microsoft.com/office/drawing/2016/5/9/chartex" xmlns:cx4="http://schemas.microsoft.com/office/drawing/2016/5/10/chartex" xmlns:cx5="http://schemas.microsoft.com/office/drawing/2016/5/11/chartex" xmlns:cx6="http://schemas.microsoft.com/office/drawing/2016/5/12/chartex" xmlns:cx7="http://schemas.microsoft.com/office/drawing/2016/5/13/chartex" xmlns:cx8="http://schemas.microsoft.com/office/drawing/2016/5/14/chartex" xmlns:mc="http://schemas.openxmlformats.org/markup-compatibility/2006" xmlns:aink="http://schemas.microsoft.com/office/drawing/2016/ink" xmlns:am3d="http://schemas.microsoft.com/office/drawing/2017/model3d" xmlns:o="urn:schemas-microsoft-com:office:office" xmlns:oel="http://schemas.microsoft.com/office/2019/extlst" xmlns:r="http://schemas.openxmlformats.org/officeDocument/2006/relationships" xmlns:m="http://schemas.openxmlformats.org/officeDocument/2006/math" xmlns:v="urn:schemas-microsoft-com:vml" xmlns:wp14="http://schemas.microsoft.com/office/word/2010/wordprocessingDrawing" xmlns:wp="http://schemas.openxmlformats.org/drawingml/2006/wordprocessingDrawing" xmlns:w10="urn:schemas-microsoft-com:office:word" xmlns:w="http://schemas.openxmlformats.org/wordprocessingml/2006/main" xmlns:w14="http://schemas.microsoft.com/office/word/2010/wordml" xmlns:w15="http://schemas.microsoft.com/office/word/2012/wordml" xmlns:w16cex="http://schemas.microsoft.com/office/word/2018/wordml/cex" xmlns:w16cid="http://schemas.microsoft.com/office/word/2016/wordml/cid" xmlns:w16="http://schemas.microsoft.com/office/word/2018/wordml" xmlns:w16du="http://schemas.microsoft.com/office/word/2023/wordml/word16du" xmlns:w16sdtdh="http://schemas.microsoft.com/office/word/2020/wordml/sdtdatahash" xmlns:w16sdtfl="http://schemas.microsoft.com/office/word/2024/wordml/sdtformatlock" xmlns:w16se="http://schemas.microsoft.com/office/word/2015/wordml/symex" xmlns:wpg="http://schemas.microsoft.com/office/word/2010/wordprocessingGroup" xmlns:wpi="http://schemas.microsoft.com/office/word/2010/wordprocessingInk" xmlns:wne="http://schemas.microsoft.com/office/word/2006/wordml" xmlns:wps="http://schemas.microsoft.com/office/word/2010/wordprocessingShape" mc:Ignorable="w14 w15 w16se w16cid w16 w16cex w16sdtdh w16sdtfl w16du wp14">
   <w:abstractNum w:abstractNumId="0" w15:restartNumberingAfterBreak="0">
     <w:nsid w:val="19EC2EE7"/>
     <w:multiLevelType w:val="hybridMultilevel"/>
@@ -1647,7 +1625,7 @@
 </file>
 
 <file path=word/styles.xml><?xml version="1.0" encoding="utf-8"?>
-<w:styles xmlns:mc="http://schemas.openxmlformats.org/markup-compatibility/2006" xmlns:r="http://schemas.openxmlformats.org/officeDocument/2006/relationships" xmlns:w="http://schemas.openxmlformats.org/wordprocessingml/2006/main" xmlns:w14="http://schemas.microsoft.com/office/word/2010/wordml" xmlns:w15="http://schemas.microsoft.com/office/word/2012/wordml" xmlns:w16cex="http://schemas.microsoft.com/office/word/2018/wordml/cex" xmlns:w16cid="http://schemas.microsoft.com/office/word/2016/wordml/cid" xmlns:w16="http://schemas.microsoft.com/office/word/2018/wordml" xmlns:w16du="http://schemas.microsoft.com/office/word/2023/wordml/word16du" xmlns:w16sdtdh="http://schemas.microsoft.com/office/word/2020/wordml/sdtdatahash" xmlns:w16se="http://schemas.microsoft.com/office/word/2015/wordml/symex" mc:Ignorable="w14 w15 w16se w16cid w16 w16cex w16sdtdh w16du">
+<w:styles xmlns:mc="http://schemas.openxmlformats.org/markup-compatibility/2006" xmlns:r="http://schemas.openxmlformats.org/officeDocument/2006/relationships" xmlns:w="http://schemas.openxmlformats.org/wordprocessingml/2006/main" xmlns:w14="http://schemas.microsoft.com/office/word/2010/wordml" xmlns:w15="http://schemas.microsoft.com/office/word/2012/wordml" xmlns:w16cex="http://schemas.microsoft.com/office/word/2018/wordml/cex" xmlns:w16cid="http://schemas.microsoft.com/office/word/2016/wordml/cid" xmlns:w16="http://schemas.microsoft.com/office/word/2018/wordml" xmlns:w16du="http://schemas.microsoft.com/office/word/2023/wordml/word16du" xmlns:w16sdtdh="http://schemas.microsoft.com/office/word/2020/wordml/sdtdatahash" xmlns:w16sdtfl="http://schemas.microsoft.com/office/word/2024/wordml/sdtformatlock" xmlns:w16se="http://schemas.microsoft.com/office/word/2015/wordml/symex" mc:Ignorable="w14 w15 w16se w16cid w16 w16cex w16sdtdh w16sdtfl w16du">
   <w:docDefaults>
     <w:rPrDefault>
       <w:rPr>

</xml_diff>